<commit_message>
final commit this version. Done with MTZ Z 1 ver
</commit_message>
<xml_diff>
--- a/mode_docx_gen/pmi_mtzt/template.docx
+++ b/mode_docx_gen/pmi_mtzt/template.docx
@@ -221,7 +221,14 @@
                 <w:sz w:val="22"/>
                 <w:highlight w:val="yellow"/>
               </w:rPr>
-              <w:t>-Р02с-B021-В021-В001-К001-К003-M046-5400-x-C02.00</w:t>
+              <w:t>-Р02с-</w:t>
+            </w:r>
+            <w:r>
+              <w:rPr>
+                <w:sz w:val="22"/>
+                <w:highlight w:val="red"/>
+              </w:rPr>
+              <w:t>B021-В021-В001-К001-К003-M046-5400-x-C02.00</w:t>
             </w:r>
           </w:p>
         </w:tc>
@@ -451,7 +458,7 @@
       <w:r>
         <w:fldChar w:fldCharType="separate"/>
       </w:r>
-      <w:hyperlink w:anchor="_Toc193978209" w:history="1">
+      <w:hyperlink w:anchor="_Toc194041287" w:history="1">
         <w:r>
           <w:rPr>
             <w:rStyle w:val="af4"/>
@@ -495,7 +502,7 @@
             <w:noProof/>
             <w:webHidden/>
           </w:rPr>
-          <w:instrText xml:space="preserve"> PAGEREF _Toc193978209 \h </w:instrText>
+          <w:instrText xml:space="preserve"> PAGEREF _Toc194041287 \h </w:instrText>
         </w:r>
         <w:r>
           <w:rPr>
@@ -537,7 +544,7 @@
           <w:lang w:val="en-US"/>
         </w:rPr>
       </w:pPr>
-      <w:hyperlink w:anchor="_Toc193978210" w:history="1">
+      <w:hyperlink w:anchor="_Toc194041288" w:history="1">
         <w:r>
           <w:rPr>
             <w:rStyle w:val="af4"/>
@@ -564,7 +571,7 @@
             <w:noProof/>
             <w:webHidden/>
           </w:rPr>
-          <w:instrText xml:space="preserve"> PAGEREF _Toc193978210 \h </w:instrText>
+          <w:instrText xml:space="preserve"> PAGEREF _Toc194041288 \h </w:instrText>
         </w:r>
         <w:r>
           <w:rPr>
@@ -606,7 +613,7 @@
           <w:lang w:val="en-US"/>
         </w:rPr>
       </w:pPr>
-      <w:hyperlink w:anchor="_Toc193978211" w:history="1">
+      <w:hyperlink w:anchor="_Toc194041289" w:history="1">
         <w:r>
           <w:rPr>
             <w:rStyle w:val="af4"/>
@@ -633,7 +640,7 @@
             <w:noProof/>
             <w:webHidden/>
           </w:rPr>
-          <w:instrText xml:space="preserve"> PAGEREF _Toc193978211 \h </w:instrText>
+          <w:instrText xml:space="preserve"> PAGEREF _Toc194041289 \h </w:instrText>
         </w:r>
         <w:r>
           <w:rPr>
@@ -675,7 +682,7 @@
           <w:lang w:val="en-US"/>
         </w:rPr>
       </w:pPr>
-      <w:hyperlink w:anchor="_Toc193978212" w:history="1">
+      <w:hyperlink w:anchor="_Toc194041290" w:history="1">
         <w:r>
           <w:rPr>
             <w:rStyle w:val="af4"/>
@@ -702,7 +709,7 @@
             <w:noProof/>
             <w:webHidden/>
           </w:rPr>
-          <w:instrText xml:space="preserve"> PAGEREF _Toc193978212 \h </w:instrText>
+          <w:instrText xml:space="preserve"> PAGEREF _Toc194041290 \h </w:instrText>
         </w:r>
         <w:r>
           <w:rPr>
@@ -744,7 +751,7 @@
           <w:lang w:val="en-US"/>
         </w:rPr>
       </w:pPr>
-      <w:hyperlink w:anchor="_Toc193978213" w:history="1">
+      <w:hyperlink w:anchor="_Toc194041291" w:history="1">
         <w:r>
           <w:rPr>
             <w:rStyle w:val="af4"/>
@@ -771,7 +778,7 @@
             <w:noProof/>
             <w:webHidden/>
           </w:rPr>
-          <w:instrText xml:space="preserve"> PAGEREF _Toc193978213 \h </w:instrText>
+          <w:instrText xml:space="preserve"> PAGEREF _Toc194041291 \h </w:instrText>
         </w:r>
         <w:r>
           <w:rPr>
@@ -813,7 +820,7 @@
           <w:lang w:val="en-US"/>
         </w:rPr>
       </w:pPr>
-      <w:hyperlink w:anchor="_Toc193978214" w:history="1">
+      <w:hyperlink w:anchor="_Toc194041292" w:history="1">
         <w:r>
           <w:rPr>
             <w:rStyle w:val="af4"/>
@@ -840,7 +847,7 @@
             <w:noProof/>
             <w:webHidden/>
           </w:rPr>
-          <w:instrText xml:space="preserve"> PAGEREF _Toc193978214 \h </w:instrText>
+          <w:instrText xml:space="preserve"> PAGEREF _Toc194041292 \h </w:instrText>
         </w:r>
         <w:r>
           <w:rPr>
@@ -882,7 +889,7 @@
           <w:lang w:val="en-US"/>
         </w:rPr>
       </w:pPr>
-      <w:hyperlink w:anchor="_Toc193978215" w:history="1">
+      <w:hyperlink w:anchor="_Toc194041293" w:history="1">
         <w:r>
           <w:rPr>
             <w:rStyle w:val="af4"/>
@@ -909,7 +916,7 @@
             <w:noProof/>
             <w:webHidden/>
           </w:rPr>
-          <w:instrText xml:space="preserve"> PAGEREF _Toc193978215 \h </w:instrText>
+          <w:instrText xml:space="preserve"> PAGEREF _Toc194041293 \h </w:instrText>
         </w:r>
         <w:r>
           <w:rPr>
@@ -951,7 +958,7 @@
           <w:lang w:val="en-US"/>
         </w:rPr>
       </w:pPr>
-      <w:hyperlink w:anchor="_Toc193978216" w:history="1">
+      <w:hyperlink w:anchor="_Toc194041294" w:history="1">
         <w:r>
           <w:rPr>
             <w:rStyle w:val="af4"/>
@@ -978,7 +985,7 @@
             <w:noProof/>
             <w:webHidden/>
           </w:rPr>
-          <w:instrText xml:space="preserve"> PAGEREF _Toc193978216 \h </w:instrText>
+          <w:instrText xml:space="preserve"> PAGEREF _Toc194041294 \h </w:instrText>
         </w:r>
         <w:r>
           <w:rPr>
@@ -1024,7 +1031,7 @@
           <w:lang w:val="en-US"/>
         </w:rPr>
       </w:pPr>
-      <w:hyperlink w:anchor="_Toc193978217" w:history="1">
+      <w:hyperlink w:anchor="_Toc194041295" w:history="1">
         <w:r>
           <w:rPr>
             <w:rStyle w:val="af4"/>
@@ -1068,7 +1075,7 @@
             <w:noProof/>
             <w:webHidden/>
           </w:rPr>
-          <w:instrText xml:space="preserve"> PAGEREF _Toc193978217 \h </w:instrText>
+          <w:instrText xml:space="preserve"> PAGEREF _Toc194041295 \h </w:instrText>
         </w:r>
         <w:r>
           <w:rPr>
@@ -1110,27 +1117,13 @@
           <w:lang w:val="en-US"/>
         </w:rPr>
       </w:pPr>
-      <w:hyperlink w:anchor="_Toc193978218" w:history="1">
+      <w:hyperlink w:anchor="_Toc194041296" w:history="1">
         <w:r>
           <w:rPr>
             <w:rStyle w:val="af4"/>
             <w:noProof/>
           </w:rPr>
-          <w:t>2.1 Подкл</w:t>
-        </w:r>
-        <w:r>
-          <w:rPr>
-            <w:rStyle w:val="af4"/>
-            <w:noProof/>
-          </w:rPr>
-          <w:t>ю</w:t>
-        </w:r>
-        <w:r>
-          <w:rPr>
-            <w:rStyle w:val="af4"/>
-            <w:noProof/>
-          </w:rPr>
-          <w:t>чение аналоговых цепей к устройству</w:t>
+          <w:t>2.1 Подключение аналоговых цепей к устройству</w:t>
         </w:r>
         <w:r>
           <w:rPr>
@@ -1151,7 +1144,7 @@
             <w:noProof/>
             <w:webHidden/>
           </w:rPr>
-          <w:instrText xml:space="preserve"> PAGEREF _Toc193978218 \h </w:instrText>
+          <w:instrText xml:space="preserve"> PAGEREF _Toc194041296 \h </w:instrText>
         </w:r>
         <w:r>
           <w:rPr>
@@ -1193,7 +1186,7 @@
           <w:lang w:val="en-US"/>
         </w:rPr>
       </w:pPr>
-      <w:hyperlink w:anchor="_Toc193978219" w:history="1">
+      <w:hyperlink w:anchor="_Toc194041297" w:history="1">
         <w:r>
           <w:rPr>
             <w:rStyle w:val="af4"/>
@@ -1220,7 +1213,7 @@
             <w:noProof/>
             <w:webHidden/>
           </w:rPr>
-          <w:instrText xml:space="preserve"> PAGEREF _Toc193978219 \h </w:instrText>
+          <w:instrText xml:space="preserve"> PAGEREF _Toc194041297 \h </w:instrText>
         </w:r>
         <w:r>
           <w:rPr>
@@ -1262,7 +1255,7 @@
           <w:lang w:val="en-US"/>
         </w:rPr>
       </w:pPr>
-      <w:hyperlink w:anchor="_Toc193978220" w:history="1">
+      <w:hyperlink w:anchor="_Toc194041298" w:history="1">
         <w:r>
           <w:rPr>
             <w:rStyle w:val="af4"/>
@@ -1289,7 +1282,7 @@
             <w:noProof/>
             <w:webHidden/>
           </w:rPr>
-          <w:instrText xml:space="preserve"> PAGEREF _Toc193978220 \h </w:instrText>
+          <w:instrText xml:space="preserve"> PAGEREF _Toc194041298 \h </w:instrText>
         </w:r>
         <w:r>
           <w:rPr>
@@ -1331,13 +1324,27 @@
           <w:lang w:val="en-US"/>
         </w:rPr>
       </w:pPr>
-      <w:hyperlink w:anchor="_Toc193978221" w:history="1">
+      <w:hyperlink w:anchor="_Toc194041299" w:history="1">
         <w:r>
           <w:rPr>
             <w:rStyle w:val="af4"/>
             <w:noProof/>
           </w:rPr>
-          <w:t>2.4 Проверка взаимодействия функций блоков МТЗ, КЦН НН1, КЦН НН2,</w:t>
+          <w:t>2.4 Проверка взаимодейст</w:t>
+        </w:r>
+        <w:r>
+          <w:rPr>
+            <w:rStyle w:val="af4"/>
+            <w:noProof/>
+          </w:rPr>
+          <w:t>в</w:t>
+        </w:r>
+        <w:r>
+          <w:rPr>
+            <w:rStyle w:val="af4"/>
+            <w:noProof/>
+          </w:rPr>
+          <w:t>ия функций блоков МТЗ, КЦН НН1, КЦН НН2,</w:t>
         </w:r>
         <w:r>
           <w:rPr>
@@ -1358,7 +1365,7 @@
             <w:noProof/>
             <w:webHidden/>
           </w:rPr>
-          <w:instrText xml:space="preserve"> PAGEREF _Toc193978221 \h </w:instrText>
+          <w:instrText xml:space="preserve"> PAGEREF _Toc194041299 \h </w:instrText>
         </w:r>
         <w:r>
           <w:rPr>
@@ -1439,7 +1446,7 @@
         <w:lastRenderedPageBreak/>
         <w:tab/>
       </w:r>
-      <w:bookmarkStart w:id="0" w:name="_Toc193978209"/>
+      <w:bookmarkStart w:id="0" w:name="_Toc194041287"/>
       <w:r>
         <w:t>ОБЩИЕ СВЕДЕНИЯ</w:t>
       </w:r>
@@ -1449,7 +1456,7 @@
       <w:pPr>
         <w:pStyle w:val="2"/>
       </w:pPr>
-      <w:bookmarkStart w:id="1" w:name="_Toc193978210"/>
+      <w:bookmarkStart w:id="1" w:name="_Toc194041288"/>
       <w:r>
         <w:t>Цель проведения испытаний</w:t>
       </w:r>
@@ -1467,7 +1474,7 @@
       <w:pPr>
         <w:pStyle w:val="2"/>
       </w:pPr>
-      <w:bookmarkStart w:id="2" w:name="_Toc193978211"/>
+      <w:bookmarkStart w:id="2" w:name="_Toc194041289"/>
       <w:r>
         <w:t>Место</w:t>
       </w:r>
@@ -1614,7 +1621,7 @@
       <w:pPr>
         <w:pStyle w:val="2"/>
       </w:pPr>
-      <w:bookmarkStart w:id="3" w:name="_Toc193978212"/>
+      <w:bookmarkStart w:id="3" w:name="_Toc194041290"/>
       <w:r>
         <w:t>Информация об объекте испытаний</w:t>
       </w:r>
@@ -1952,7 +1959,7 @@
       <w:pPr>
         <w:pStyle w:val="2"/>
       </w:pPr>
-      <w:bookmarkStart w:id="4" w:name="_Toc193978213"/>
+      <w:bookmarkStart w:id="4" w:name="_Toc194041291"/>
       <w:r>
         <w:t>Период проведения испытаний</w:t>
       </w:r>
@@ -1979,7 +1986,7 @@
       <w:pPr>
         <w:pStyle w:val="2"/>
       </w:pPr>
-      <w:bookmarkStart w:id="5" w:name="_Toc193978214"/>
+      <w:bookmarkStart w:id="5" w:name="_Toc194041292"/>
       <w:r>
         <w:t>Условия проведения испытаний и измерений</w:t>
       </w:r>
@@ -1997,7 +2004,7 @@
       <w:pPr>
         <w:pStyle w:val="2"/>
       </w:pPr>
-      <w:bookmarkStart w:id="6" w:name="_Toc193978215"/>
+      <w:bookmarkStart w:id="6" w:name="_Toc194041293"/>
       <w:r>
         <w:t>Нормативная документация</w:t>
       </w:r>
@@ -2018,7 +2025,7 @@
       <w:pPr>
         <w:pStyle w:val="2"/>
       </w:pPr>
-      <w:bookmarkStart w:id="7" w:name="_Toc193978216"/>
+      <w:bookmarkStart w:id="7" w:name="_Toc194041294"/>
       <w:r>
         <w:lastRenderedPageBreak/>
         <w:t>Перечень используемых средств измерений (СИ), испытательного оборудования (ИО) и вспомогательного оборудования (ВО)</w:t>
@@ -3529,7 +3536,7 @@
       <w:pPr>
         <w:pStyle w:val="1"/>
       </w:pPr>
-      <w:bookmarkStart w:id="8" w:name="_Toc193978217"/>
+      <w:bookmarkStart w:id="8" w:name="_Toc194041295"/>
       <w:r>
         <w:lastRenderedPageBreak/>
         <w:t>ПРОГРАММА И МЕТОДИКИ ПРОВЕДЕНИЯ ИСПЫТАНИЙ</w:t>
@@ -3540,7 +3547,7 @@
       <w:pPr>
         <w:pStyle w:val="2"/>
       </w:pPr>
-      <w:bookmarkStart w:id="9" w:name="_Toc193978218"/>
+      <w:bookmarkStart w:id="9" w:name="_Toc194041296"/>
       <w:r>
         <w:t>Подключение аналоговых цепей к устройству</w:t>
       </w:r>
@@ -3625,7 +3632,7 @@
           <v:shape id="_x0000_i1025" type="#_x0000_t75" style="width:199.85pt;height:200.45pt" o:ole="">
             <v:imagedata r:id="rId10" o:title=""/>
           </v:shape>
-          <o:OLEObject Type="Embed" ProgID="Acrobat.Document.DC" ShapeID="_x0000_i1025" DrawAspect="Content" ObjectID="_1804594825" r:id="rId11"/>
+          <o:OLEObject Type="Embed" ProgID="Acrobat.Document.DC" ShapeID="_x0000_i1025" DrawAspect="Content" ObjectID="_1804657306" r:id="rId11"/>
         </w:object>
       </w:r>
     </w:p>
@@ -3641,7 +3648,7 @@
       <w:pPr>
         <w:pStyle w:val="2"/>
       </w:pPr>
-      <w:bookmarkStart w:id="10" w:name="_Toc193978219"/>
+      <w:bookmarkStart w:id="10" w:name="_Toc194041297"/>
       <w:r>
         <w:t>Подключение дискретных входных и выходных цепей устройства</w:t>
       </w:r>
@@ -3667,7 +3674,7 @@
           <v:shape id="_x0000_i1026" type="#_x0000_t75" style="width:411.85pt;height:283.4pt" o:ole="">
             <v:imagedata r:id="rId12" o:title=""/>
           </v:shape>
-          <o:OLEObject Type="Embed" ProgID="Acrobat.Document.DC" ShapeID="_x0000_i1026" DrawAspect="Content" ObjectID="_1804594826" r:id="rId13"/>
+          <o:OLEObject Type="Embed" ProgID="Acrobat.Document.DC" ShapeID="_x0000_i1026" DrawAspect="Content" ObjectID="_1804657307" r:id="rId13"/>
         </w:object>
       </w:r>
     </w:p>
@@ -3683,7 +3690,7 @@
       <w:pPr>
         <w:pStyle w:val="2"/>
       </w:pPr>
-      <w:bookmarkStart w:id="11" w:name="_Toc193978220"/>
+      <w:bookmarkStart w:id="11" w:name="_Toc194041298"/>
       <w:r>
         <w:lastRenderedPageBreak/>
         <w:t>Проверка функциональных клавиш и светодиодов</w:t>
@@ -7162,7 +7169,7 @@
       <w:pPr>
         <w:pStyle w:val="2"/>
       </w:pPr>
-      <w:bookmarkStart w:id="13" w:name="_Toc193978221"/>
+      <w:bookmarkStart w:id="13" w:name="_Toc194041299"/>
       <w:r>
         <w:t>Проверка взаимодействия функций блоков МТЗ, КЦН НН1, КЦН НН2,</w:t>
       </w:r>
@@ -8390,67 +8397,70 @@
               <w:jc w:val="left"/>
             </w:pPr>
             <w:r>
+              <w:t>В НН</w:t>
+            </w:r>
+            <w:r>
+              <w:t xml:space="preserve"> включен</w:t>
+            </w:r>
+          </w:p>
+        </w:tc>
+      </w:tr>
+      <w:tr>
+        <w:tc>
+          <w:tcPr>
+            <w:tcW w:w="2482" w:type="dxa"/>
+          </w:tcPr>
+          <w:p>
+            <w:pPr>
+              <w:pStyle w:val="af0"/>
+            </w:pPr>
+            <w:r>
+              <w:t>М3</w:t>
+            </w:r>
+            <w:r>
+              <w:rPr>
+                <w:lang w:val="en-US"/>
+              </w:rPr>
+              <w:t>.XB:</w:t>
+            </w:r>
+            <w:r>
+              <w:t>4</w:t>
+            </w:r>
+          </w:p>
+        </w:tc>
+        <w:tc>
+          <w:tcPr>
+            <w:tcW w:w="2062" w:type="dxa"/>
+          </w:tcPr>
+          <w:p>
+            <w:pPr>
+              <w:pStyle w:val="af0"/>
+              <w:rPr>
+                <w:lang w:val="en-US"/>
+              </w:rPr>
+            </w:pPr>
+            <w:r>
+              <w:t>М3</w:t>
+            </w:r>
+            <w:r>
+              <w:rPr>
+                <w:lang w:val="en-US"/>
+              </w:rPr>
+              <w:t>.4</w:t>
+            </w:r>
+          </w:p>
+        </w:tc>
+        <w:tc>
+          <w:tcPr>
+            <w:tcW w:w="5061" w:type="dxa"/>
+          </w:tcPr>
+          <w:p>
+            <w:pPr>
+              <w:pStyle w:val="af0"/>
+              <w:jc w:val="left"/>
+            </w:pPr>
+            <w:r>
               <w:t>Срабатывание внешнего БНН</w:t>
-            </w:r>
-          </w:p>
-        </w:tc>
-      </w:tr>
-      <w:tr>
-        <w:tc>
-          <w:tcPr>
-            <w:tcW w:w="2482" w:type="dxa"/>
-          </w:tcPr>
-          <w:p>
-            <w:pPr>
-              <w:pStyle w:val="af0"/>
-            </w:pPr>
-            <w:r>
-              <w:t>М3</w:t>
-            </w:r>
-            <w:r>
-              <w:rPr>
-                <w:lang w:val="en-US"/>
-              </w:rPr>
-              <w:t>.XB:</w:t>
-            </w:r>
-            <w:r>
-              <w:t>4</w:t>
-            </w:r>
-          </w:p>
-        </w:tc>
-        <w:tc>
-          <w:tcPr>
-            <w:tcW w:w="2062" w:type="dxa"/>
-          </w:tcPr>
-          <w:p>
-            <w:pPr>
-              <w:pStyle w:val="af0"/>
-              <w:rPr>
-                <w:lang w:val="en-US"/>
-              </w:rPr>
-            </w:pPr>
-            <w:r>
-              <w:t>М3</w:t>
-            </w:r>
-            <w:r>
-              <w:rPr>
-                <w:lang w:val="en-US"/>
-              </w:rPr>
-              <w:t>.4</w:t>
-            </w:r>
-          </w:p>
-        </w:tc>
-        <w:tc>
-          <w:tcPr>
-            <w:tcW w:w="5061" w:type="dxa"/>
-          </w:tcPr>
-          <w:p>
-            <w:pPr>
-              <w:pStyle w:val="af0"/>
-              <w:jc w:val="left"/>
-            </w:pPr>
-            <w:r>
-              <w:t>Резерв</w:t>
             </w:r>
           </w:p>
         </w:tc>
@@ -9907,10 +9917,7 @@
         <w:t xml:space="preserve"> </w:t>
       </w:r>
       <w:r>
-        <w:t xml:space="preserve">ЮНИТ-М300 для проверки </w:t>
-      </w:r>
-      <w:r>
-        <w:t>общих цепей МТЗ</w:t>
+        <w:t>ЮНИТ-М300 для проверки общих цепей МТЗ</w:t>
       </w:r>
     </w:p>
     <w:tbl>
@@ -10203,8 +10210,6 @@
                 <w:lang w:val="en-US"/>
               </w:rPr>
             </w:pPr>
-            <w:bookmarkStart w:id="15" w:name="_GoBack"/>
-            <w:bookmarkEnd w:id="15"/>
             <w:r>
               <w:t>М3</w:t>
             </w:r>
@@ -10226,13 +10231,7 @@
               <w:jc w:val="left"/>
             </w:pPr>
             <w:r>
-              <w:t xml:space="preserve">ОВ МТЗ </w:t>
-            </w:r>
-            <w:r>
-              <w:t>2</w:t>
-            </w:r>
-            <w:r>
-              <w:t xml:space="preserve"> </w:t>
+              <w:t xml:space="preserve">ОВ МТЗ 2 </w:t>
             </w:r>
             <w:r>
               <w:t>ст</w:t>
@@ -10295,10 +10294,7 @@
               <w:jc w:val="left"/>
             </w:pPr>
             <w:r>
-              <w:t>ОВ МТЗ 3</w:t>
-            </w:r>
-            <w:r>
-              <w:t xml:space="preserve"> </w:t>
+              <w:t xml:space="preserve">ОВ МТЗ 3 </w:t>
             </w:r>
             <w:r>
               <w:t>ст</w:t>
@@ -11206,7 +11202,10 @@
               <w:jc w:val="left"/>
             </w:pPr>
             <w:r>
-              <w:t>Резерв</w:t>
+              <w:rPr>
+                <w:color w:val="00B050"/>
+              </w:rPr>
+              <w:t>КПОН внеш</w:t>
             </w:r>
           </w:p>
         </w:tc>
@@ -12109,7 +12108,10 @@
               <w:jc w:val="left"/>
             </w:pPr>
             <w:r>
-              <w:t>Резерв</w:t>
+              <w:rPr>
+                <w:color w:val="00B050"/>
+              </w:rPr>
+              <w:t>КПОН внеш</w:t>
             </w:r>
           </w:p>
         </w:tc>
@@ -13018,7 +13020,10 @@
               <w:jc w:val="left"/>
             </w:pPr>
             <w:r>
-              <w:t>Резерв</w:t>
+              <w:rPr>
+                <w:color w:val="00B050"/>
+              </w:rPr>
+              <w:t>КПОН внеш</w:t>
             </w:r>
           </w:p>
         </w:tc>
@@ -13591,11 +13596,11 @@
       <w:pPr>
         <w:pStyle w:val="a"/>
       </w:pPr>
-      <w:bookmarkStart w:id="16" w:name="_Ref191631805"/>
+      <w:bookmarkStart w:id="15" w:name="_Ref191631805"/>
       <w:r>
         <w:t>Выходные реле устройства ЮНИТ-М300 для проверки БНТ</w:t>
       </w:r>
-      <w:bookmarkEnd w:id="16"/>
+      <w:bookmarkEnd w:id="15"/>
     </w:p>
     <w:tbl>
       <w:tblPr>
@@ -14868,7 +14873,7 @@
               <w:jc w:val="left"/>
             </w:pPr>
             <w:r>
-              <w:t>ПС: Пуск</w:t>
+              <w:t>-</w:t>
             </w:r>
           </w:p>
         </w:tc>
@@ -18528,6 +18533,9 @@
               <w:pStyle w:val="af0"/>
               <w:jc w:val="left"/>
             </w:pPr>
+            <w:r>
+              <w:t>Резерв</w:t>
+            </w:r>
           </w:p>
         </w:tc>
       </w:tr>
@@ -18597,6 +18605,9 @@
               <w:pStyle w:val="af0"/>
               <w:jc w:val="left"/>
             </w:pPr>
+            <w:r>
+              <w:t>Резерв</w:t>
+            </w:r>
           </w:p>
         </w:tc>
       </w:tr>
@@ -18661,7 +18672,7 @@
               <w:jc w:val="left"/>
             </w:pPr>
             <w:r>
-              <w:t>-</w:t>
+              <w:t>Резерв</w:t>
             </w:r>
           </w:p>
         </w:tc>
@@ -19816,6 +19827,9 @@
               <w:pStyle w:val="af0"/>
               <w:jc w:val="left"/>
             </w:pPr>
+            <w:r>
+              <w:t>Резерв</w:t>
+            </w:r>
           </w:p>
         </w:tc>
       </w:tr>
@@ -19885,6 +19899,9 @@
               <w:pStyle w:val="af0"/>
               <w:jc w:val="left"/>
             </w:pPr>
+            <w:r>
+              <w:t>Резерв</w:t>
+            </w:r>
           </w:p>
         </w:tc>
       </w:tr>
@@ -19949,7 +19966,7 @@
               <w:jc w:val="left"/>
             </w:pPr>
             <w:r>
-              <w:t>-</w:t>
+              <w:t>Резерв</w:t>
             </w:r>
           </w:p>
         </w:tc>
@@ -21048,6 +21065,7 @@
             <w:pPr>
               <w:pStyle w:val="af0"/>
             </w:pPr>
+            <w:bookmarkStart w:id="16" w:name="_GoBack" w:colFirst="2" w:colLast="2"/>
             <w:r>
               <w:t>М10</w:t>
             </w:r>
@@ -21105,9 +21123,13 @@
               <w:pStyle w:val="af0"/>
               <w:jc w:val="left"/>
             </w:pPr>
-          </w:p>
-        </w:tc>
-      </w:tr>
+            <w:r>
+              <w:t>Резерв</w:t>
+            </w:r>
+          </w:p>
+        </w:tc>
+      </w:tr>
+      <w:bookmarkEnd w:id="16"/>
       <w:tr>
         <w:tc>
           <w:tcPr>
@@ -21174,6 +21196,9 @@
               <w:pStyle w:val="af0"/>
               <w:jc w:val="left"/>
             </w:pPr>
+            <w:r>
+              <w:t>Резерв</w:t>
+            </w:r>
           </w:p>
         </w:tc>
       </w:tr>
@@ -21238,7 +21263,7 @@
               <w:jc w:val="left"/>
             </w:pPr>
             <w:r>
-              <w:t>-</w:t>
+              <w:t>Резерв</w:t>
             </w:r>
           </w:p>
         </w:tc>
@@ -21839,7 +21864,7 @@
             <w:rPr>
               <w:noProof/>
             </w:rPr>
-            <w:t>13</w:t>
+            <w:t>12</w:t>
           </w:r>
           <w:r>
             <w:fldChar w:fldCharType="end"/>
@@ -21847,27 +21872,14 @@
           <w:r>
             <w:t xml:space="preserve"> из </w:t>
           </w:r>
-          <w:r>
-            <w:fldChar w:fldCharType="begin"/>
-          </w:r>
-          <w:r>
-            <w:instrText xml:space="preserve"> NUMPAGES </w:instrText>
-          </w:r>
-          <w:r>
-            <w:fldChar w:fldCharType="separate"/>
-          </w:r>
-          <w:r>
-            <w:rPr>
-              <w:noProof/>
-            </w:rPr>
-            <w:t>13</w:t>
-          </w:r>
-          <w:r>
-            <w:rPr>
-              <w:noProof/>
-            </w:rPr>
-            <w:fldChar w:fldCharType="end"/>
-          </w:r>
+          <w:fldSimple w:instr=" NUMPAGES ">
+            <w:r>
+              <w:rPr>
+                <w:noProof/>
+              </w:rPr>
+              <w:t>13</w:t>
+            </w:r>
+          </w:fldSimple>
           <w:r>
             <w:t xml:space="preserve"> </w:t>
           </w:r>
@@ -23989,7 +24001,7 @@
 </file>
 
 <file path=customXml/itemProps1.xml><?xml version="1.0" encoding="utf-8"?>
-<ds:datastoreItem xmlns:ds="http://schemas.openxmlformats.org/officeDocument/2006/customXml" ds:itemID="{D4049D01-8E66-4C98-8190-DD90133A7668}">
+<ds:datastoreItem xmlns:ds="http://schemas.openxmlformats.org/officeDocument/2006/customXml" ds:itemID="{3D529A15-E68B-4497-BA80-E78F4DCC8546}">
   <ds:schemaRefs>
     <ds:schemaRef ds:uri="http://schemas.openxmlformats.org/officeDocument/2006/bibliography"/>
   </ds:schemaRefs>

</xml_diff>